<commit_message>
Further work on stage 1 and 2 activities
</commit_message>
<xml_diff>
--- a/week4/Stage_1_SmartCare_v01_and_AI_Activity_Card.docx
+++ b/week4/Stage_1_SmartCare_v01_and_AI_Activity_Card.docx
@@ -53,7 +53,10 @@
     </w:p>
     <w:p>
       <w:r>
-        <w:t>Write approximately 100 words.</w:t>
+        <w:t xml:space="preserve">SmartCare Community Clinic (SCCC) currently uses analogue system to record patients and appointments. A software solution needs to be developed to </w:t>
+      </w:r>
+      <w:r>
+        <w:t>enable better access for multiple users, improved storage, recording keeping and organization.</w:t>
       </w:r>
     </w:p>
     <w:p>
@@ -101,13 +104,21 @@
           <w:tcPr>
             <w:tcW w:w="5040" w:type="dxa"/>
           </w:tcPr>
-          <w:p/>
+          <w:p>
+            <w:r>
+              <w:t>Patients</w:t>
+            </w:r>
+          </w:p>
         </w:tc>
         <w:tc>
           <w:tcPr>
             <w:tcW w:w="5040" w:type="dxa"/>
           </w:tcPr>
-          <w:p/>
+          <w:p>
+            <w:r>
+              <w:t>Ability to have appointments booked and kept track of</w:t>
+            </w:r>
+          </w:p>
         </w:tc>
       </w:tr>
       <w:tr>
@@ -115,13 +126,21 @@
           <w:tcPr>
             <w:tcW w:w="5040" w:type="dxa"/>
           </w:tcPr>
-          <w:p/>
+          <w:p>
+            <w:r>
+              <w:t>Practitioners</w:t>
+            </w:r>
+          </w:p>
         </w:tc>
         <w:tc>
           <w:tcPr>
             <w:tcW w:w="5040" w:type="dxa"/>
           </w:tcPr>
-          <w:p/>
+          <w:p>
+            <w:r>
+              <w:t>Access to relevant appointments</w:t>
+            </w:r>
+          </w:p>
         </w:tc>
       </w:tr>
       <w:tr>
@@ -129,13 +148,21 @@
           <w:tcPr>
             <w:tcW w:w="5040" w:type="dxa"/>
           </w:tcPr>
-          <w:p/>
+          <w:p>
+            <w:r>
+              <w:t>Management</w:t>
+            </w:r>
+          </w:p>
         </w:tc>
         <w:tc>
           <w:tcPr>
             <w:tcW w:w="5040" w:type="dxa"/>
           </w:tcPr>
-          <w:p/>
+          <w:p>
+            <w:r>
+              <w:t>Simplicity, efficiency</w:t>
+            </w:r>
+          </w:p>
         </w:tc>
       </w:tr>
       <w:tr>
@@ -333,12 +360,12 @@
     </w:p>
     <w:p>
       <w:r>
+        <w:lastRenderedPageBreak/>
         <w:t>2. ______________________________________________________________</w:t>
       </w:r>
     </w:p>
     <w:p>
       <w:r>
-        <w:lastRenderedPageBreak/>
         <w:t>3. ______________________________________________________________</w:t>
       </w:r>
     </w:p>

</xml_diff>